<commit_message>
updated the borrower relation
</commit_message>
<xml_diff>
--- a/Assignments/Ass1Logical/rcl_model_normalization.docx
+++ b/Assignments/Ass1Logical/rcl_model_normalization.docx
@@ -364,6 +364,16 @@
         <w:suppressLineNumbers w:val="0"/>
         <w:bidi w:val="0"/>
         <w:spacing w:before="0" w:beforeAutospacing="0" w:after="0" w:afterAutospacing="0" w:line="17" w:lineRule="atLeast"/>
+        <w:rPr>
+          <w:rFonts w:hint="default" w:ascii="Arial" w:hAnsi="Arial" w:cs="Arial"/>
+          <w:i w:val="0"/>
+          <w:iCs w:val="0"/>
+          <w:color w:val="000000"/>
+          <w:sz w:val="22"/>
+          <w:szCs w:val="22"/>
+          <w:u w:val="none"/>
+          <w:vertAlign w:val="baseline"/>
+        </w:rPr>
       </w:pPr>
       <w:r>
         <w:rPr>
@@ -378,6 +388,27 @@
         </w:rPr>
         <w:t>Candidate Keys:</w:t>
       </w:r>
+    </w:p>
+    <w:p>
+      <w:pPr>
+        <w:pStyle w:val="9"/>
+        <w:keepNext w:val="0"/>
+        <w:keepLines w:val="0"/>
+        <w:widowControl/>
+        <w:suppressLineNumbers w:val="0"/>
+        <w:bidi w:val="0"/>
+        <w:spacing w:before="0" w:beforeAutospacing="0" w:after="0" w:afterAutospacing="0" w:line="17" w:lineRule="atLeast"/>
+        <w:rPr>
+          <w:rFonts w:hint="default" w:ascii="Arial" w:hAnsi="Arial" w:cs="Arial"/>
+          <w:i w:val="0"/>
+          <w:iCs w:val="0"/>
+          <w:color w:val="000000"/>
+          <w:sz w:val="22"/>
+          <w:szCs w:val="22"/>
+          <w:u w:val="none"/>
+          <w:vertAlign w:val="baseline"/>
+        </w:rPr>
+      </w:pPr>
     </w:p>
     <w:p>
       <w:pPr>
@@ -1464,102 +1495,6 @@
         <w:spacing w:after="240" w:afterAutospacing="0"/>
         <w:jc w:val="left"/>
       </w:pPr>
-      <w:r>
-        <w:rPr>
-          <w:rFonts w:ascii="宋体" w:hAnsi="宋体" w:eastAsia="宋体" w:cs="宋体"/>
-          <w:b w:val="0"/>
-          <w:bCs w:val="0"/>
-          <w:kern w:val="0"/>
-          <w:sz w:val="24"/>
-          <w:szCs w:val="24"/>
-          <w:lang w:val="en-US" w:eastAsia="zh-CN" w:bidi="ar"/>
-        </w:rPr>
-        <w:br w:type="textWrapping"/>
-      </w:r>
-      <w:r>
-        <w:rPr>
-          <w:rFonts w:ascii="宋体" w:hAnsi="宋体" w:eastAsia="宋体" w:cs="宋体"/>
-          <w:b w:val="0"/>
-          <w:bCs w:val="0"/>
-          <w:kern w:val="0"/>
-          <w:sz w:val="24"/>
-          <w:szCs w:val="24"/>
-          <w:lang w:val="en-US" w:eastAsia="zh-CN" w:bidi="ar"/>
-        </w:rPr>
-        <w:br w:type="textWrapping"/>
-      </w:r>
-      <w:r>
-        <w:rPr>
-          <w:rFonts w:ascii="宋体" w:hAnsi="宋体" w:eastAsia="宋体" w:cs="宋体"/>
-          <w:b w:val="0"/>
-          <w:bCs w:val="0"/>
-          <w:kern w:val="0"/>
-          <w:sz w:val="24"/>
-          <w:szCs w:val="24"/>
-          <w:lang w:val="en-US" w:eastAsia="zh-CN" w:bidi="ar"/>
-        </w:rPr>
-        <w:br w:type="textWrapping"/>
-      </w:r>
-      <w:r>
-        <w:rPr>
-          <w:rFonts w:ascii="宋体" w:hAnsi="宋体" w:eastAsia="宋体" w:cs="宋体"/>
-          <w:b w:val="0"/>
-          <w:bCs w:val="0"/>
-          <w:kern w:val="0"/>
-          <w:sz w:val="24"/>
-          <w:szCs w:val="24"/>
-          <w:lang w:val="en-US" w:eastAsia="zh-CN" w:bidi="ar"/>
-        </w:rPr>
-        <w:br w:type="textWrapping"/>
-      </w:r>
-      <w:r>
-        <w:rPr>
-          <w:rFonts w:ascii="宋体" w:hAnsi="宋体" w:eastAsia="宋体" w:cs="宋体"/>
-          <w:b w:val="0"/>
-          <w:bCs w:val="0"/>
-          <w:kern w:val="0"/>
-          <w:sz w:val="24"/>
-          <w:szCs w:val="24"/>
-          <w:lang w:val="en-US" w:eastAsia="zh-CN" w:bidi="ar"/>
-        </w:rPr>
-        <w:br w:type="textWrapping"/>
-      </w:r>
-      <w:r>
-        <w:rPr>
-          <w:rFonts w:ascii="宋体" w:hAnsi="宋体" w:eastAsia="宋体" w:cs="宋体"/>
-          <w:b w:val="0"/>
-          <w:bCs w:val="0"/>
-          <w:kern w:val="0"/>
-          <w:sz w:val="24"/>
-          <w:szCs w:val="24"/>
-          <w:lang w:val="en-US" w:eastAsia="zh-CN" w:bidi="ar"/>
-        </w:rPr>
-        <w:br w:type="textWrapping"/>
-      </w:r>
-      <w:r>
-        <w:rPr>
-          <w:rFonts w:ascii="宋体" w:hAnsi="宋体" w:eastAsia="宋体" w:cs="宋体"/>
-          <w:b w:val="0"/>
-          <w:bCs w:val="0"/>
-          <w:kern w:val="0"/>
-          <w:sz w:val="24"/>
-          <w:szCs w:val="24"/>
-          <w:lang w:val="en-US" w:eastAsia="zh-CN" w:bidi="ar"/>
-        </w:rPr>
-        <w:br w:type="textWrapping"/>
-      </w:r>
-      <w:r>
-        <w:rPr>
-          <w:rFonts w:ascii="宋体" w:hAnsi="宋体" w:eastAsia="宋体" w:cs="宋体"/>
-          <w:b w:val="0"/>
-          <w:bCs w:val="0"/>
-          <w:kern w:val="0"/>
-          <w:sz w:val="24"/>
-          <w:szCs w:val="24"/>
-          <w:lang w:val="en-US" w:eastAsia="zh-CN" w:bidi="ar"/>
-        </w:rPr>
-        <w:br w:type="textWrapping"/>
-      </w:r>
       <w:r>
         <w:rPr>
           <w:rFonts w:ascii="宋体" w:hAnsi="宋体" w:eastAsia="宋体" w:cs="宋体"/>
@@ -2232,10 +2167,10 @@
   <w:latentStyles w:count="260" w:defQFormat="0" w:defUnhideWhenUsed="1" w:defSemiHidden="1" w:defUIPriority="99" w:defLockedState="0">
     <w:lsdException w:unhideWhenUsed="0" w:uiPriority="0" w:semiHidden="0" w:name="Normal"/>
     <w:lsdException w:unhideWhenUsed="0" w:uiPriority="0" w:semiHidden="0" w:name="heading 1"/>
-    <w:lsdException w:unhideWhenUsed="0" w:uiPriority="0" w:semiHidden="0" w:name="heading 2"/>
+    <w:lsdException w:qFormat="1" w:unhideWhenUsed="0" w:uiPriority="0" w:semiHidden="0" w:name="heading 2"/>
     <w:lsdException w:unhideWhenUsed="0" w:uiPriority="0" w:semiHidden="0" w:name="heading 3"/>
-    <w:lsdException w:unhideWhenUsed="0" w:uiPriority="0" w:semiHidden="0" w:name="heading 4"/>
-    <w:lsdException w:unhideWhenUsed="0" w:uiPriority="0" w:semiHidden="0" w:name="heading 5"/>
+    <w:lsdException w:qFormat="1" w:unhideWhenUsed="0" w:uiPriority="0" w:semiHidden="0" w:name="heading 4"/>
+    <w:lsdException w:qFormat="1" w:unhideWhenUsed="0" w:uiPriority="0" w:semiHidden="0" w:name="heading 5"/>
     <w:lsdException w:qFormat="1" w:unhideWhenUsed="0" w:uiPriority="0" w:semiHidden="0" w:name="heading 6"/>
     <w:lsdException w:qFormat="1" w:uiPriority="0" w:name="heading 7"/>
     <w:lsdException w:qFormat="1" w:uiPriority="0" w:name="heading 8"/>
@@ -2512,6 +2447,7 @@
     <w:name w:val="heading 2"/>
     <w:basedOn w:val="1"/>
     <w:next w:val="1"/>
+    <w:qFormat/>
     <w:uiPriority w:val="0"/>
     <w:pPr>
       <w:keepNext/>
@@ -2545,6 +2481,7 @@
     <w:name w:val="heading 4"/>
     <w:basedOn w:val="1"/>
     <w:next w:val="1"/>
+    <w:qFormat/>
     <w:uiPriority w:val="0"/>
     <w:pPr>
       <w:keepNext/>
@@ -2562,6 +2499,7 @@
     <w:name w:val="heading 5"/>
     <w:basedOn w:val="1"/>
     <w:next w:val="1"/>
+    <w:qFormat/>
     <w:uiPriority w:val="0"/>
     <w:pPr>
       <w:keepNext/>

</xml_diff>